<commit_message>
docs(governance): rebuild DOCX/PDF outputs after the final fix wave
Regenerated with python -m analysis_tools.governance_build; two consecutive
builds produce byte-identical files (sha256 compared for all 12 outputs).

Co-Authored-By: Claude Opus 5.5 <noreply@anthropic.com>
</commit_message>
<xml_diff>
--- a/docs/governance/build/asasname.docx
+++ b/docs/governance/build/asasname.docx
@@ -91,7 +91,7 @@
           <w:rFonts w:ascii="Tahoma" w:hAnsi="Tahoma" w:cs="Tahoma"/>
           <w:rtl/>
         </w:rPr>
-        <w:t>ماده ۴ (سلسله‌مراتب و اعتبارگذاری اسناد داخلی): این اساسنامه سند بنیادین انجمن است. اسناد داخلی تابع این اساسنامه‌اند، هر یک جداگانه اصلاح می‌شوند و در صورت تعارض، حکم سند بالاتر معتبر است. شورای مرکزی شیوه‌نامه داخلی خود و اصلاحات آن را با حد نصاب مقرر در همان سند تصویب می‌کند؛ منشور مجمع و شیوه‌نامه اجرایی آن به تصویب خودِ مجمع در جلسات باز می‌رسد. هیچ‌یک نباید با این اساسنامه و مقررات بالادستی مغایر باشد.</w:t>
+        <w:t>ماده ۴ (سلسله‌مراتب و مرجع تصویب اسناد داخلی): این اساسنامه سند بنیادین انجمن است. اسناد داخلی تابع این اساسنامه‌اند، هر یک جداگانه اصلاح می‌شوند و در صورت تعارض، حکم سند بالاتر معتبر است. شورای مرکزی شیوه‌نامه داخلی خود و اصلاحات آن را با حد نصاب مقرر در همان سند تصویب می‌کند؛ منشور مجمع و شیوه‌نامه اجرایی آن به تصویب خودِ مجمع در جلسات باز می‌رسد. هیچ‌یک نباید با این اساسنامه و مقررات بالادستی مغایر باشد.</w:t>
       </w:r>
     </w:p>
     <w:p>
@@ -303,6 +303,18 @@
           <w:rFonts w:ascii="Tahoma" w:hAnsi="Tahoma" w:cs="Tahoma"/>
           <w:rtl/>
         </w:rPr>
+        <w:t>تبصره ۴: هر جلسه عمومی، سالانه یا فوق‌العاده، را دبیر می‌گشاید و ریاست آن با یکی از اعضای حاضر انجمن است که عضو شورا نباشد و در آغاز جلسه با رأی بیش از نیمی از حاضران دارای حق رأی برگزیده می‌شود.</w:t>
+      </w:r>
+    </w:p>
+    <w:p>
+      <w:pPr>
+        <w:bidi/>
+      </w:pPr>
+      <w:r>
+        <w:rPr>
+          <w:rFonts w:ascii="Tahoma" w:hAnsi="Tahoma" w:cs="Tahoma"/>
+          <w:rtl/>
+        </w:rPr>
         <w:t>ماده ۱۲ (اختیارات جلسه عمومی): اختیارات جلسه عمومی عبارت‌اند از: (۱) تصویب و اصلاح اساسنامه؛ (۲) بررسی و تأیید گزارش عملکرد و گزارش مالی شورا؛ (۳) نظارت بر عملکرد و امور مالی انجمن؛ (۴) طرح پرسش، انتقاد و پیشنهاد و دریافت پاسخ شورا و دبیر؛ (۵) نظارت بر انتخابات شورا از راه استماع گزارش کمیته انتخابات (مطابق ماده ۲۳ همین اساسنامه). نظارت رسمی بر انتخابات، مطابق ماده ۱۸ آیین‌نامه، با معاونت است.</w:t>
       </w:r>
     </w:p>
@@ -315,7 +327,7 @@
           <w:rFonts w:ascii="Tahoma" w:hAnsi="Tahoma" w:cs="Tahoma"/>
           <w:rtl/>
         </w:rPr>
-        <w:t>ماده ۱۳ (جلسه عمومی فوق‌العاده): شورا جلسه عمومی فوق‌العاده را به تصمیم خود یا به درخواست کتبی دبیر یا دست‌کم یک‌پنجم اعضای انجمن برگزار می‌کند؛ این جلسه فقط به موضوع مشخص‌شده در تصمیم یا درخواست می‌پردازد و ظرف یک ماه پس از تصمیم شورا یا وصول درخواست تشکیل می‌شود. جلسه فوق‌العاده جایگزین جلسه عمومی سالانه نیست و رسمیت و تصویب در آن تابع تبصره‌های ماده ۱۱ همین اساسنامه است.</w:t>
+        <w:t>ماده ۱۳ (جلسه عمومی فوق‌العاده): شورا جلسه عمومی فوق‌العاده را به تصمیم خود یا به درخواست کتبی دبیر یا دست‌کم یک‌پنجم اعضای انجمن برگزار می‌کند؛ این جلسه فقط به موضوع مشخص‌شده در تصمیم یا درخواست می‌پردازد و ظرف یک ماه پس از تصمیم شورا یا وصول درخواست تشکیل می‌شود. اگر شورا ظرف یک ماه پس از وصول درخواست کتبی معتبر جلسه را تشکیل ندهد، درخواست‌کنندگان می‌توانند تشکیل آن را از معاونت فرهنگی و اجتماعی دانشگاه بخواهند. جلسه فوق‌العاده جایگزین جلسه عمومی سالانه نیست و رسمیت و تصویب در آن تابع تبصره‌های ماده ۱۱ همین اساسنامه است.</w:t>
       </w:r>
     </w:p>
     <w:p>
@@ -603,7 +615,7 @@
           <w:rFonts w:ascii="Tahoma" w:hAnsi="Tahoma" w:cs="Tahoma"/>
           <w:rtl/>
         </w:rPr>
-        <w:t>ماده ۱۶ (جلسات و مصوبات شورا): شورا جلسات منظم برگزار می‌کند و برای هر جلسه صورت‌جلسه تهیه می‌شود. رسمیت جلسات با حضور بیش از نیمی از اعضای شوراست و مصوبات با رأی بیش از نیمی از حاضران تصویب می‌شود، مگر آنکه شیوه‌نامه داخلی برای دسته‌ای از تصمیم‌ها نصاب بالاتری مقرر کرده باشد. رأی کتبی غایبان و حضور برخط، در حدودی که شیوه‌نامه داخلی تعیین می‌کند، معتبر است. آیین تفصیلی جلسات و تصمیم‌گیری در شیوه‌نامه داخلی شورای مرکزی می‌آید.</w:t>
+        <w:t>ماده ۱۶ (جلسات و مصوبات شورا): شورا جلسات منظم برگزار می‌کند و برای هر جلسه صورت‌جلسه تهیه می‌شود. رسمیت جلسات با حضور بیش از نیمی از اعضای موجود شوراست؛ کرسی خالی و عضو در تعلیق در شمار اعضای موجود نیستند. مصوبات با رأی بیش از نیمی از حاضران تصویب می‌شود، مگر آنکه شیوه‌نامه داخلی برای دسته‌ای از تصمیم‌ها نصاب بالاتری مقرر کرده باشد. رأی کتبی غایبان و حضور برخط، در حدودی که شیوه‌نامه داخلی تعیین می‌کند، معتبر است. آیین تفصیلی جلسات و تصمیم‌گیری در شیوه‌نامه داخلی شورای مرکزی می‌آید.</w:t>
       </w:r>
     </w:p>
     <w:p>
@@ -615,7 +627,7 @@
           <w:rFonts w:ascii="Tahoma" w:hAnsi="Tahoma" w:cs="Tahoma"/>
           <w:rtl/>
         </w:rPr>
-        <w:t>ماده ۱۷ (دبیر): شورا در نخستین جلسه خود دبیر را از میان اعضای اصلی با رأی بیش از نیمی از اعضای حاضر شورای جدید انتخاب می‌کند. دبیر مسئول اجرای مصوبات شورا و نماینده و سخنگوی رسمی انجمن نزد همه مراجع است (آیین‌نامه، تبصره ۳ ماده ۱۷). در صورت خروج دبیر از شورا یا کناره‌گیری او از دبیری، شورا ظرف یک هفته جانشین او را به همین ترتیب انتخاب می‌کند. اختیارات تفصیلی دبیر در شیوه‌نامه داخلی می‌آید.</w:t>
+        <w:t>ماده ۱۷ (دبیر): شورا در نخستین جلسه خود دبیر را از میان اعضای اصلی با رأی بیش از نیمی از اعضای حاضر شورای جدید انتخاب می‌کند. دبیر مسئول اجرای مصوبات شورا و نماینده و سخنگوی رسمی انجمن نزد همه مراجع است (آیین‌نامه، تبصره ۳ ماده ۱۷). شورا می‌تواند پس از شنیدن توضیحات دبیر و با رأی ۵ از کل ۷ نفر، دبیر دیگری را به جای او برگزیند؛ این تصمیم فقط به دبیری او پایان می‌دهد و عضویتش در شورا را لغو نمی‌کند. در این حالت، و نیز در صورت خروج دبیر از شورا یا کناره‌گیری او از دبیری، شورا ظرف یک هفته دبیر تازه را به همین ترتیب از میان اعضای اصلی انتخاب می‌کند. اختیارات تفصیلی دبیر در شیوه‌نامه داخلی می‌آید.</w:t>
       </w:r>
     </w:p>
     <w:p>
@@ -739,7 +751,7 @@
           <w:rFonts w:ascii="Tahoma" w:hAnsi="Tahoma" w:cs="Tahoma"/>
           <w:rtl/>
         </w:rPr>
-        <w:t>ماده ۲۴ (آغاز دوره و انتقال): نخستین جلسه شورای جدید بی‌درنگ پس از اعلام رسمی نتیجه انتخابات، به دعوت شورای پیشین و با حضور اعضای هر دو شورا برگزار می‌شود. در این جلسه اسناد، اموال، دسترسی‌ها و تجربه‌های دوره پیشین به شورای جدید منتقل می‌شود، شورای جدید دبیر خود را انتخاب می‌کند و مسئولیت‌ها را میان اعضا تقسیم می‌کند. تفصیل انتقال دوره در شیوه‌نامه داخلی می‌آید.</w:t>
+        <w:t>ماده ۲۴ (آغاز دوره و انتقال): نخستین جلسه شورای جدید (جلسه تحویل) بی‌درنگ و حداکثر ظرف چهارده روز پس از اعلام رسمی نتیجه انتخابات، به دعوت شورای پیشین و با حضور اعضای هر دو شورا برگزار می‌شود؛ اگر شورای پیشین در این مهلت جلسه را فرا نخواند، کمیته انتخابات آن را فرا می‌خواند. در این جلسه اسناد، اموال، دسترسی‌ها و تجربه‌های دوره پیشین به شورای جدید منتقل می‌شود، شورای جدید دبیر خود را انتخاب می‌کند و مسئولیت‌ها را میان اعضا تقسیم می‌کند. تفصیل انتقال دوره در شیوه‌نامه داخلی می‌آید.</w:t>
       </w:r>
     </w:p>
     <w:p>
@@ -751,7 +763,7 @@
           <w:rFonts w:ascii="Tahoma" w:hAnsi="Tahoma" w:cs="Tahoma"/>
           <w:rtl/>
         </w:rPr>
-        <w:t>ماده ۲۵ (لغو خودکار عضویت در شورا): عضویت در شورا در هر یک از این موارد خودبه‌خود لغو می‌شود: عضویت هم‌زمان در شورای مرکزی تشکل دیگر، اعم از صنفی، سیاسی، ورزشی یا فرهنگی، بسیج دانشجویی یا جهاد دانشگاهی؛ محکومیت انضباطی منجر به توبیخ کتبی با درج در پرونده یا بالاتر؛ معدل مشروط در نیمسال گذشته؛ فارغ‌التحصیلی (آیین‌نامه، ماده ۲۴). پیگیری این شرایط تکلیف دبیر است و کرسی خالی مطابق تبصره ۲ ماده ۱۴ همین اساسنامه تکمیل می‌شود. هرگاه عضو علی‌البدلی باقی نماند یا شمار اعضای شورا به کمتر از شش نفر برسد، انتخابات میان‌دوره‌ای برای باقی‌مانده دوره و مطابق ماده ۲۳ همین اساسنامه حداکثر ظرف یک ماه برگزار می‌شود.</w:t>
+        <w:t>ماده ۲۵ (لغو خودکار عضویت در شورا): عضویت در شورا در هر یک از این موارد خودبه‌خود لغو می‌شود: عضویت هم‌زمان در شورای مرکزی تشکل دیگر، اعم از صنفی، سیاسی، ورزشی یا فرهنگی، بسیج دانشجویی یا جهاد دانشگاهی؛ محکومیت انضباطی منجر به توبیخ کتبی با درج در پرونده یا بالاتر؛ معدل مشروط در نیمسال گذشته؛ فارغ‌التحصیلی (آیین‌نامه، ماده ۲۴). پیگیری این شرایط تکلیف دبیر است. با خالی شدن هر کرسی، نخست مطابق تبصره ۲ ماده ۱۴ همین اساسنامه عمل می‌شود: اگر کرسی اصلی خالی شده باشد علی‌البدل ارتقا می‌یابد، و کرسی خالی علی‌البدل به نفرات بعدی همان انتخابات عرضه می‌شود؛ فقط اگر پس از این عرضه‌ها شمار اعضای شورا کمتر از شش نفر بماند، انتخابات میان‌دوره‌ای برای باقی‌مانده دوره و مطابق ماده ۲۳ همین اساسنامه حداکثر ظرف یک ماه پس از پایان عرضه‌ها برگزار می‌شود.</w:t>
       </w:r>
     </w:p>
     <w:p>
@@ -803,7 +815,7 @@
           <w:rFonts w:ascii="Tahoma" w:hAnsi="Tahoma" w:cs="Tahoma"/>
           <w:rtl/>
         </w:rPr>
-        <w:t>ماده ۲۸ (مسیر رسمی وجوه): هر وجهی که به نام انجمن دریافت می‌شود فقط به درگاه یا حسابی واریز می‌شود که دانشگاه تعیین کرده است. دریافت وجه به نام انجمن به کارت یا حساب شخصی تخلف و قابل پیگرد است. هر هزینه باید مستند باشد و با امضای مسئول مالی و دبیر انجام شود؛ این دو امضا باید از دو شخص متفاوت باشد.</w:t>
+        <w:t>ماده ۲۸ (مسیر رسمی وجوه): هر وجهی که به نام انجمن دریافت می‌شود فقط به درگاه یا حسابی واریز می‌شود که دانشگاه تعیین کرده است. دریافت وجه به نام انجمن به کارت یا حساب شخصی تخلف و قابل پیگرد است. هر هزینه باید مستند باشد و با امضای مسئول مالی و دبیر انجام شود؛ هرگاه یکی از آن دو خود طرف پرداخت باشد یا در دسترس نباشد، جانشینی که شیوه‌نامه داخلی تعیین می‌کند به جای او امضا می‌کند. در هر حال، دو امضای هر پرداخت از دو شخص متفاوت است.</w:t>
       </w:r>
     </w:p>
     <w:p>
@@ -827,7 +839,7 @@
           <w:rFonts w:ascii="Tahoma" w:hAnsi="Tahoma" w:cs="Tahoma"/>
           <w:rtl/>
         </w:rPr>
-        <w:t>ماده ۳۰ (مازاد درآمد برنامه‌ها): مازاد درآمد برنامه‌ها سود انجمن یا اعضا نیست و در مسیر رسمی دانشگاه باقی می‌ماند. مازاد فقط با مصوبه شورا و اعلام به مجمع و معاونت صرف فعالیت‌های علمی و آموزشی، تجهیزات و یارانه ثبت‌نام انجمن می‌شود. تقسیم مازاد میان اعضا، به هر شکل، ممنوع است.</w:t>
+        <w:t>ماده ۳۰ (مازاد درآمد برنامه‌ها): مازاد درآمد برنامه‌ها سود انجمن یا اعضا نیست و در مسیر رسمی دانشگاه باقی می‌ماند. مازاد فقط با مصوبه شورا صرف فعالیت‌های علمی و آموزشی، تجهیزات و یارانه ثبت‌نام انجمن می‌شود و مبلغ و مصرف پیشنهادی آن پیش از صرف به مجمع و معاونت اعلام می‌شود. تقسیم مازاد میان اعضا، به هر شکل، ممنوع است.</w:t>
       </w:r>
     </w:p>
     <w:p>
@@ -879,7 +891,7 @@
           <w:rFonts w:ascii="Tahoma" w:hAnsi="Tahoma" w:cs="Tahoma"/>
           <w:rtl/>
         </w:rPr>
-        <w:t>ماده ۳۳ (گروه‌های کاری مجمع و تیم‌های پروژه‌ای): گروه‌های کاری و تیم‌های پروژه‌ای ساختارهای مشارکتی مجمع در حالت باز هستند؛ مشارکت در آن‌ها داوطلبانه است و سلسله‌مراتب الزامی ندارند. چارچوب فعالیت آن‌ها در منشور مجمع و شیوه‌نامه اجرایی مجمع می‌آید. فعالیتی از این ساختارها که از آستانه‌های موضوعیت فراتر رود، با هماهنگی شورا و با رعایت ماده ۸ همین اساسنامه انجام می‌شود. آستانه‌های موضوعیت (نام انجمن، وجه، میهمان بیرونی و…) در شیوه‌نامه اجرایی مجمع تعیین می‌شود.</w:t>
+        <w:t>ماده ۳۳ (گروه‌های کاری مجمع و تیم‌های پروژه‌ای): گروه‌های کاری و تیم‌های پروژه‌ای ساختارهای مشارکتی مجمع در حالت باز هستند؛ مشارکت در آن‌ها داوطلبانه است و سلسله‌مراتب الزامی ندارند. چارچوب فعالیت آن‌ها در منشور مجمع و شیوه‌نامه اجرایی مجمع می‌آید. فعالیتی از این ساختارها که از آستانه‌های موضوعیت فراتر رود، با هماهنگی شورا و با رعایت ماده ۸ همین اساسنامه انجام می‌شود. آستانه‌های موضوعیت در شیوه‌نامه اجرایی مجمع و در چارچوب تبصره ۱ ماده ۸ همین اساسنامه تعیین می‌شود.</w:t>
       </w:r>
     </w:p>
     <w:p>
@@ -1105,7 +1117,7 @@
           <w:rFonts w:ascii="Tahoma" w:hAnsi="Tahoma" w:cs="Tahoma"/>
           <w:rtl/>
         </w:rPr>
-        <w:t>این اساسنامه در هفت بخش، سی‌ونه ماده و دوازده تبصره در جلسه عمومی انجمن مورخ — به تصویب و در تاریخ — به تأیید معاونت فرهنگی و اجتماعی دانشگاه رسید.</w:t>
+        <w:t>این اساسنامه در هفت بخش، سی‌ونه ماده و سیزده تبصره در جلسه عمومی انجمن مورخ — به تصویب و در تاریخ — به تأیید معاونت فرهنگی و اجتماعی دانشگاه رسید.</w:t>
       </w:r>
     </w:p>
     <w:sectPr>

</xml_diff>